<commit_message>
Juggle Circle only, Hexad test links, player IDs and opt-out line
Co-Authored-By: Claude Opus 5.5 <noreply@anthropic.com>
</commit_message>
<xml_diff>
--- a/week-02/files/CRE342_W2_Juggle_Circle_Activity_Sheet.docx
+++ b/week-02/files/CRE342_W2_Juggle_Circle_Activity_Sheet.docx
@@ -1224,7 +1224,16 @@
                 <w:sz w:val="20"/>
                 <w:szCs w:val="20"/>
               </w:rPr>
-              <w:t xml:space="preserve">Anyone can call “pause” at any time.</w:t>
+              <w:t xml:space="preserve">Anyone can call “pause” at any time. </w:t>
+            </w:r>
+            <w:r>
+              <w:rPr>
+                <w:rFonts w:ascii="Arial" w:cs="Arial" w:eastAsia="Arial" w:hAnsi="Arial"/>
+                <w:color w:val="1A2238"/>
+                <w:sz w:val="20"/>
+                <w:szCs w:val="20"/>
+              </w:rPr>
+              <w:t xml:space="preserve">Rather not throw and catch? Take the GM, recorder or distractor role instead.</w:t>
             </w:r>
           </w:p>
         </w:tc>
@@ -1262,7 +1271,7 @@
           <w:sz w:val="20"/>
           <w:szCs w:val="20"/>
         </w:rPr>
-        <w:t xml:space="preserve">Name / ID  </w:t>
+        <w:t xml:space="preserve">Player ID or initials  </w:t>
       </w:r>
       <w:r>
         <w:rPr>
@@ -1271,7 +1280,7 @@
           <w:sz w:val="20"/>
           <w:szCs w:val="20"/>
         </w:rPr>
-        <w:t xml:space="preserve">______________________   </w:t>
+        <w:t xml:space="preserve">_____________   </w:t>
       </w:r>
       <w:r>
         <w:rPr>
@@ -1323,7 +1332,7 @@
           <w:sz w:val="20"/>
           <w:szCs w:val="20"/>
         </w:rPr>
-        <w:t xml:space="preserve">My player type (top Hexad type)  </w:t>
+        <w:t xml:space="preserve">My top Hexad type  </w:t>
       </w:r>
       <w:r>
         <w:rPr>
@@ -1332,7 +1341,16 @@
           <w:sz w:val="20"/>
           <w:szCs w:val="20"/>
         </w:rPr>
-        <w:t xml:space="preserve">___________________________________</w:t>
+        <w:t xml:space="preserve">_____________________   </w:t>
+      </w:r>
+      <w:r>
+        <w:rPr>
+          <w:rFonts w:ascii="Arial" w:cs="Arial" w:eastAsia="Arial" w:hAnsi="Arial"/>
+          <w:color w:val="5B6488"/>
+          <w:sz w:val="17"/>
+          <w:szCs w:val="17"/>
+        </w:rPr>
+        <w:t xml:space="preserve">test: hexad.gamified.uk/test, or write “not sure”</w:t>
       </w:r>
     </w:p>
     <w:p>
@@ -3248,7 +3266,7 @@
                 <w:sz w:val="18"/>
                 <w:szCs w:val="18"/>
               </w:rPr>
-              <w:t xml:space="preserve">Player (write the name)</w:t>
+              <w:t xml:space="preserve">Player (ID or initials)</w:t>
             </w:r>
           </w:p>
         </w:tc>

</xml_diff>